<commit_message>
Schedule change: Days 1-3 Wed 14 to Fri 16 Oct, weekend rest, Days 4-7 Mon 19 to Thu 22 Oct; remove CIBN attribution
Co-Authored-By: Claude Sonnet 5.5 <noreply@anthropic.com>
</commit_message>
<xml_diff>
--- a/syllabus/MIPF_October_2026_Course_Syllabus.docx
+++ b/syllabus/MIPF_October_2026_Course_Syllabus.docx
@@ -208,7 +208,7 @@
           <w:color w:val="A8700F"/>
           <w:sz w:val="32"/>
         </w:rPr>
-        <w:t>14th – 21st October 2026</w:t>
+        <w:t>14th – 22nd October 2026</w:t>
       </w:r>
     </w:p>
     <w:tbl>
@@ -393,7 +393,7 @@
           <w:color w:val="5C6B7A"/>
           <w:sz w:val="22"/>
         </w:rPr>
-        <w:t>Open-enrolment programme  |  Seven teaching days, Wednesday 14th to Wednesday 21st October 2026 (Sunday 18th is a rest day)</w:t>
+        <w:t>Open-enrolment programme  |  Seven teaching days: Wednesday 14th to Friday 16th and Monday 19th to Thursday 22nd October 2026 (Saturday 17th and Sunday 18th are rest days)</w:t>
       </w:r>
     </w:p>
     <w:p>
@@ -533,7 +533,7 @@
           <w:b w:val="0"/>
           <w:i w:val="0"/>
         </w:rPr>
-        <w:t>This boot camp is delivered in 4 modules over seven teaching days (14th–21st October 2026, with Sunday 18th October as a rest day). Below is an overview of the areas covered in the 4 modules.</w:t>
+        <w:t>This boot camp is delivered in 4 modules over seven teaching days (Wednesday 14th to Friday 16th and Monday 19th to Thursday 22nd October 2026, with Saturday 17th and Sunday 18th October as rest days). Below is an overview of the areas covered in the 4 modules.</w:t>
       </w:r>
     </w:p>
     <w:p>
@@ -1218,7 +1218,7 @@
                 <w:i w:val="0"/>
                 <w:sz w:val="20"/>
               </w:rPr>
-              <w:t>Saturday 17th October 2026</w:t>
+              <w:t>Monday 19th October 2026</w:t>
             </w:r>
           </w:p>
         </w:tc>
@@ -1288,7 +1288,7 @@
                 <w:i w:val="0"/>
                 <w:sz w:val="20"/>
               </w:rPr>
-              <w:t>Monday 19th October 2026</w:t>
+              <w:t>Tuesday 20th October 2026</w:t>
             </w:r>
           </w:p>
         </w:tc>
@@ -1358,7 +1358,7 @@
                 <w:i w:val="0"/>
                 <w:sz w:val="20"/>
               </w:rPr>
-              <w:t>Tuesday 20th October 2026</w:t>
+              <w:t>Wednesday 21st October 2026</w:t>
             </w:r>
           </w:p>
         </w:tc>
@@ -1428,7 +1428,7 @@
                 <w:i w:val="0"/>
                 <w:sz w:val="20"/>
               </w:rPr>
-              <w:t>Wednesday 21st October 2026</w:t>
+              <w:t>Thursday 22nd October 2026</w:t>
             </w:r>
           </w:p>
         </w:tc>
@@ -1480,7 +1480,7 @@
           <w:color w:val="5C6B7A"/>
           <w:sz w:val="19"/>
         </w:rPr>
-        <w:t>Timings follow the 2026 curriculum. Sunday 18th October is a rest day. Coffee and lunch breaks are shown in the timetable.</w:t>
+        <w:t>Timings follow the 2026 curriculum. Saturday 17th and Sunday 18th October are rest days. Coffee and lunch breaks are shown in the timetable.</w:t>
       </w:r>
     </w:p>
     <w:p>
@@ -1858,7 +1858,7 @@
           <w:color w:val="5C6B7A"/>
           <w:sz w:val="21"/>
         </w:rPr>
-        <w:t>Day 1 follows one deal from structuring to credit committee: Project Sahel Sun, a 50 MW solar plant in Kano State. Nigeria's reference transaction, the Azura-Edo IPP, anchors every concept, and the Lekki concessions, the 2nd Niger Bridge and the Road Infrastructure Tax Credit Scheme show where structures succeed or stall. The Day 1 material is adapted from the LBS workshop built for the CIBN Centre for Financial Studies. The Harvard cases used in earlier editions are retained as alternative reading.</w:t>
+        <w:t>Day 1 follows one deal from structuring to credit committee: Project Sahel Sun, a 50 MW solar plant in Kano State. Nigeria's reference transaction, the Azura-Edo IPP, anchors every concept, and the Lekki concessions, the 2nd Niger Bridge and the Road Infrastructure Tax Credit Scheme show where structures succeed or stall. The Harvard cases used in earlier editions are retained as alternative reading.</w:t>
       </w:r>
     </w:p>
     <w:p>
@@ -3102,7 +3102,7 @@
           <w:i/>
           <w:sz w:val="21"/>
         </w:rPr>
-        <w:t>ESG session condensed from the CIBN 25-minute slot; the ESG checklist for Sahel Sun is in the deck.</w:t>
+        <w:t>ESG session condensed to fit the full-day format; the ESG checklist for Sahel Sun is in the deck.</w:t>
       </w:r>
     </w:p>
     <w:p>
@@ -6409,7 +6409,7 @@
           <w:color w:val="A8700F"/>
           <w:sz w:val="26"/>
         </w:rPr>
-        <w:t>Day 4  |  Saturday 17th October 2026</w:t>
+        <w:t>Day 4  |  Monday 19th October 2026</w:t>
       </w:r>
     </w:p>
     <w:p>
@@ -6425,7 +6425,7 @@
           <w:color w:val="5C6B7A"/>
           <w:sz w:val="21"/>
         </w:rPr>
-        <w:t>Hands-on in Excel with the TrainStat start model: a 20-year, quarterly model of an international and domestic train service. Today: orientation, the financial statements, revenue, operating cost and tax. (Sunday 18th October is a rest day.)</w:t>
+        <w:t>Hands-on in Excel with the TrainStat start model: a 20-year, quarterly model of an international and domestic train service. Today: orientation, the financial statements, revenue, operating cost and tax. (Day 4 follows the weekend rest: Saturday 17th and Sunday 18th October are rest days.)</w:t>
       </w:r>
     </w:p>
     <w:p>
@@ -7306,7 +7306,7 @@
           <w:color w:val="A8700F"/>
           <w:sz w:val="26"/>
         </w:rPr>
-        <w:t>Day 5  |  Monday 19th October 2026</w:t>
+        <w:t>Day 5  |  Tuesday 20th October 2026</w:t>
       </w:r>
     </w:p>
     <w:p>
@@ -8140,7 +8140,7 @@
           <w:color w:val="A8700F"/>
           <w:sz w:val="26"/>
         </w:rPr>
-        <w:t>Day 6  |  Tuesday 20th October 2026</w:t>
+        <w:t>Day 6  |  Wednesday 21st October 2026</w:t>
       </w:r>
     </w:p>
     <w:p>
@@ -9013,7 +9013,7 @@
           <w:color w:val="A8700F"/>
           <w:sz w:val="26"/>
         </w:rPr>
-        <w:t>Day 7  |  Wednesday 21st October 2026</w:t>
+        <w:t>Day 7  |  Thursday 22nd October 2026</w:t>
       </w:r>
     </w:p>
     <w:p>
@@ -10981,7 +10981,7 @@
           <w:color w:val="5C6B7A"/>
           <w:sz w:val="20"/>
         </w:rPr>
-        <w:t xml:space="preserve">  – Prof Bongo Adi, LBS (adapted from the CIBN workshop)</w:t>
+        <w:t xml:space="preserve">  – Prof Bongo Adi, LBS</w:t>
       </w:r>
     </w:p>
     <w:p>
@@ -11005,7 +11005,7 @@
           <w:color w:val="5C6B7A"/>
           <w:sz w:val="20"/>
         </w:rPr>
-        <w:t xml:space="preserve">  – Prof Bongo Adi, LBS (adapted from the CIBN workshop)</w:t>
+        <w:t xml:space="preserve">  – Prof Bongo Adi, LBS</w:t>
       </w:r>
     </w:p>
     <w:p>
@@ -11029,7 +11029,7 @@
           <w:color w:val="5C6B7A"/>
           <w:sz w:val="20"/>
         </w:rPr>
-        <w:t xml:space="preserve">  – Prof Bongo Adi, LBS (adapted from the CIBN workshop)</w:t>
+        <w:t xml:space="preserve">  – Prof Bongo Adi, LBS</w:t>
       </w:r>
     </w:p>
     <w:p>
@@ -11996,7 +11996,7 @@
         <w:color w:val="5C6B7A"/>
         <w:sz w:val="16"/>
       </w:rPr>
-      <w:t>Lagos Business School  |  MIPF Boot Camp  |  14–21 October 2026  |  Prof Bongo Adi  +234 706 164 8699  |  badi@lbs.edu.ng  |  bongo.adi@fulbrightmail.org</w:t>
+      <w:t>Lagos Business School  |  MIPF Boot Camp  |  14–22 October 2026  |  Prof Bongo Adi  +234 706 164 8699  |  badi@lbs.edu.ng  |  bongo.adi@fulbrightmail.org</w:t>
     </w:r>
   </w:p>
 </w:ftr>

</xml_diff>